<commit_message>
3.A.24 y 3.A.20: respuestas de Víctor (A24-01…05, A20-01…05)
- 3.A.24: se mantienen las fuentes del original, buscadas a fondo (A24-05):
  Ekelund y Hébert (p. 649), Kahneman, Knetsch y Thaler (p. S285), Nerón
  en la conferencia Nobel de Sen, Inman fig. 3.6, Roberts (1980) con
  Blackorby y Donaldson (1982), Harsanyi (1975), Gibbard (1974), Wilson
  (1972) y Gravelle y Rees (cap. 13); la frase de Atkinson va como idea
  suya, sin comillas, porque no aparece literal en su obra.
- 3.A.20: reparto 8′ / 11′ / 7′30″ (A20-02, opción c): medio minuto de II.5 a I.3.
- Resto de dudas con la opción recomendada; canon con las decisiones
  marcadas, fichas nuevas aprobadas y pendiente del capítulo de Gravelle y
  Rees en el 3.A.22; refranes de los dos temas en CRITERIOS §8.

Co-Authored-By: Claude Opus 5.5 <noreply@anthropic.com>
Claude-Session: https://claude.ai/code/session_01GHmnmpZ4KoguEZPymyjyrT
</commit_message>
<xml_diff>
--- a/oposicion/temario/tercer-ejercicio/3A20.docx
+++ b/oposicion/temario/tercer-ejercicio/3A20.docx
@@ -1815,7 +1815,7 @@
         <w:t xml:space="preserve">Nota al opositor. </w:t>
       </w:r>
       <w:r>
-        <w:t xml:space="preserve">Reparto del cante: introducción, 2′30″; I, 7′30″ (I.1, 2′30″; I.2, 2′30″; I.3, 2′30″); II, 11′30″ (II.1, 2′; II.2, 2′; II.3, 3′30″; II.4, 2′; II.5, 2′); III, 7′30″ (III.1, 2′; III.2, 1′30″; III.3, 1′30″; III.4, 2′30″), y conclusión, 1′. El bloque </w:t>
+        <w:t xml:space="preserve">Reparto del cante: introducción, 2′30″; I, 8′ (I.1, 2′30″; I.2, 2′30″; I.3, 3′); II, 11′ (II.1, 2′; II.2, 2′; II.3, 3′30″; II.4, 2′; II.5, 1′30″); III, 7′30″ (III.1, 2′; III.2, 1′30″; III.3, 1′30″; III.4, 2′30″), y conclusión, 1′. El bloque </w:t>
       </w:r>
       <w:hyperlink w:anchor="sec_informacion_asimetrica">
         <w:r>
@@ -2090,7 +2090,7 @@
         <w:rPr>
           <w:rStyle w:val="Minutos"/>
         </w:rPr>
-        <w:t xml:space="preserve">7′30″</w:t>
+        <w:t xml:space="preserve">8′</w:t>
       </w:r>
     </w:p>
     <w:p>
@@ -2160,7 +2160,7 @@
         <w:t xml:space="preserve"> </w:t>
       </w:r>
       <w:r>
-        <w:t xml:space="preserve">(2′30″). La tabla de supuestos y el esquema por etapas, como apoyo.</w:t>
+        <w:t xml:space="preserve">(3′). La tabla de supuestos y el esquema por etapas, como apoyo.</w:t>
       </w:r>
     </w:p>
     <w:p>
@@ -9364,7 +9364,7 @@
         <w:rPr>
           <w:rStyle w:val="Minutos"/>
         </w:rPr>
-        <w:t xml:space="preserve">11′30″</w:t>
+        <w:t xml:space="preserve">11′</w:t>
       </w:r>
     </w:p>
     <w:p>
@@ -9507,7 +9507,7 @@
         <w:t xml:space="preserve"> </w:t>
       </w:r>
       <w:r>
-        <w:t xml:space="preserve">(2′). La escala de la potencia (gráfico </w:t>
+        <w:t xml:space="preserve">(1′30″). La escala de la potencia (gráfico </w:t>
       </w:r>
       <w:hyperlink w:anchor="fig_escala_potencia">
         <w:r>

</xml_diff>

<commit_message>
3.A.20: páginas con p. y pp. tras § en las citas de Mueller
Co-Authored-By: Claude Opus 5.5 <noreply@anthropic.com>
Claude-Session: https://claude.ai/code/session_01GHmnmpZ4KoguEZPymyjyrT
</commit_message>
<xml_diff>
--- a/oposicion/temario/tercer-ejercicio/3A20.docx
+++ b/oposicion/temario/tercer-ejercicio/3A20.docx
@@ -49268,11 +49268,11 @@
           <w:rPr>
             <w:rStyle w:val="Hyperlink"/>
           </w:rPr>
-          <w:t xml:space="preserve">, 2003, §§ 16.4.2, 370</w:t>
-        </w:r>
-      </w:hyperlink>
-      <w:r>
-        <w:t xml:space="preserve">)</w:t>
+          <w:t xml:space="preserve">, 2003, § 16.4.2</w:t>
+        </w:r>
+      </w:hyperlink>
+      <w:r>
+        <w:t xml:space="preserve">, p. 370)</w:t>
       </w:r>
       <w:r>
         <w:t xml:space="preserve">;</w:t>
@@ -63610,11 +63610,11 @@
           <w:rPr>
             <w:rStyle w:val="Hyperlink"/>
           </w:rPr>
-          <w:t xml:space="preserve">, 2003, §§ 15.6, 355–358</w:t>
-        </w:r>
-      </w:hyperlink>
-      <w:r>
-        <w:t xml:space="preserve">)</w:t>
+          <w:t xml:space="preserve">, 2003, § 15.6</w:t>
+        </w:r>
+      </w:hyperlink>
+      <w:r>
+        <w:t xml:space="preserve">, pp. 355-358)</w:t>
       </w:r>
       <w:r>
         <w:t xml:space="preserve">: del 7,3 % de la renta nacional de la India en 1964, solo por las licencias de importación</w:t>

</xml_diff>